<commit_message>
Revisione Pattern: Data Transfer Object, aggiunta UML corretto, revisione codice e documentazione
</commit_message>
<xml_diff>
--- a/designPattern/DataTransferObject/Documentazione Data Transfer Object.docx
+++ b/designPattern/DataTransferObject/Documentazione Data Transfer Object.docx
@@ -62,15 +62,7 @@
     </w:p>
     <w:p>
       <w:r>
-        <w:t xml:space="preserve">Il Data Transfer Object è un oggetto usato per trasportare dati tra due parti di un sistema, soprattutto in scenari remoti come </w:t>
-      </w:r>
-      <w:proofErr w:type="spellStart"/>
-      <w:r>
-        <w:t>client-server</w:t>
-      </w:r>
-      <w:proofErr w:type="spellEnd"/>
-      <w:r>
-        <w:t>. Contiene dati e basta: niente logica complessa.</w:t>
+        <w:t>Il Data Transfer Object è un oggetto usato per trasportare dati tra due parti di un sistema, soprattutto in scenari remoti come client-server. Contiene dati e basta: niente logica complessa.</w:t>
       </w:r>
     </w:p>
     <w:p>
@@ -97,8 +89,60 @@
       </w:r>
     </w:p>
     <w:p>
-      <w:r>
-        <w:t>Domain Object: rappresenta il dominio applicativo, per esempio User o Role. DTO: contiene i dati da trasferire. Assembler/Mapper: converte i Domain Object in DTO e viceversa.</w:t>
+      <w:pPr>
+        <w:pStyle w:val="Paragrafoelenco"/>
+        <w:numPr>
+          <w:ilvl w:val="0"/>
+          <w:numId w:val="1"/>
+        </w:numPr>
+      </w:pPr>
+      <w:r>
+        <w:rPr>
+          <w:b/>
+          <w:bCs/>
+        </w:rPr>
+        <w:t>Domain Object</w:t>
+      </w:r>
+      <w:r>
+        <w:t xml:space="preserve">: rappresenta il dominio applicativo, per esempio User o Role. </w:t>
+      </w:r>
+    </w:p>
+    <w:p>
+      <w:pPr>
+        <w:pStyle w:val="Paragrafoelenco"/>
+        <w:numPr>
+          <w:ilvl w:val="0"/>
+          <w:numId w:val="1"/>
+        </w:numPr>
+      </w:pPr>
+      <w:r>
+        <w:rPr>
+          <w:b/>
+          <w:bCs/>
+        </w:rPr>
+        <w:t>DTO</w:t>
+      </w:r>
+      <w:r>
+        <w:t xml:space="preserve">: contiene i dati da trasferire. </w:t>
+      </w:r>
+    </w:p>
+    <w:p>
+      <w:pPr>
+        <w:pStyle w:val="Paragrafoelenco"/>
+        <w:numPr>
+          <w:ilvl w:val="0"/>
+          <w:numId w:val="1"/>
+        </w:numPr>
+      </w:pPr>
+      <w:r>
+        <w:rPr>
+          <w:b/>
+          <w:bCs/>
+        </w:rPr>
+        <w:t>Assembler/Mapper</w:t>
+      </w:r>
+      <w:r>
+        <w:t>: converte i Domain Object in DTO e viceversa.</w:t>
       </w:r>
     </w:p>
     <w:p>
@@ -112,15 +156,7 @@
     </w:p>
     <w:p>
       <w:r>
-        <w:t xml:space="preserve">Il client chiede dati al server. Il server prende i Domain Object, li trasforma in DTO tramite un </w:t>
-      </w:r>
-      <w:proofErr w:type="spellStart"/>
-      <w:r>
-        <w:t>assembler</w:t>
-      </w:r>
-      <w:proofErr w:type="spellEnd"/>
-      <w:r>
-        <w:t xml:space="preserve"> e restituisce il DTO. Se il client deve creare o modificare dati, invia un DTO che viene riconvertito in Domain Object.</w:t>
+        <w:t>Il client chiede dati al server. Il server prende i Domain Object, li trasforma in DTO tramite un assembler e restituisce il DTO. Se il client deve creare o modificare dati, invia un DTO che viene riconvertito in Domain Object.</w:t>
       </w:r>
     </w:p>
     <w:p>
@@ -140,29 +176,7 @@
         <w:t>uolo</w:t>
       </w:r>
       <w:r>
-        <w:t xml:space="preserve">, il sistema può restituire un </w:t>
-      </w:r>
-      <w:proofErr w:type="spellStart"/>
-      <w:r>
-        <w:t>UserDTO</w:t>
-      </w:r>
-      <w:proofErr w:type="spellEnd"/>
-      <w:r>
-        <w:t xml:space="preserve"> con nome, </w:t>
-      </w:r>
-      <w:r>
-        <w:t>e-mail</w:t>
-      </w:r>
-      <w:r>
-        <w:t xml:space="preserve"> e ruolo. Per creare un nuovo utente, il client invia un </w:t>
-      </w:r>
-      <w:proofErr w:type="spellStart"/>
-      <w:r>
-        <w:t>UserDTO</w:t>
-      </w:r>
-      <w:proofErr w:type="spellEnd"/>
-      <w:r>
-        <w:t xml:space="preserve"> e il server lo trasforma in un oggetto User</w:t>
+        <w:t>, il sistema può restituire un UserDTO con nome, e-mail e ruolo. Per creare un nuovo utente, il client invia un UserDTO e il server lo trasforma in un oggetto User</w:t>
       </w:r>
       <w:r>
         <w:t>.</w:t>
@@ -209,24 +223,20 @@
         </w:rPr>
       </w:pPr>
       <w:r>
-        <w:t>Il costruttore crea un utente completo, mentre i metodi </w:t>
-      </w:r>
-      <w:proofErr w:type="spellStart"/>
-      <w:r>
-        <w:t>get</w:t>
-      </w:r>
-      <w:proofErr w:type="spellEnd"/>
-      <w:proofErr w:type="gramStart"/>
-      <w:r>
-        <w:t>...(</w:t>
-      </w:r>
-      <w:proofErr w:type="gramEnd"/>
-      <w:r>
-        <w:t>) servono per leggere i dati.</w:t>
-      </w:r>
-    </w:p>
-    <w:p>
-      <w:r>
+        <w:t>Il costruttore crea un utente completo, mentre i metodi get</w:t>
+      </w:r>
+      <w:r>
+        <w:t>tter</w:t>
+      </w:r>
+      <w:r>
+        <w:t>() servono per leggere i dati.</w:t>
+      </w:r>
+    </w:p>
+    <w:p>
+      <w:r>
+        <w:rPr>
+          <w:noProof/>
+        </w:rPr>
         <w:drawing>
           <wp:inline distT="0" distB="0" distL="0" distR="0" wp14:anchorId="116BE7FB" wp14:editId="2A5D0F55">
             <wp:extent cx="6645910" cy="3312795"/>
@@ -243,7 +253,7 @@
                     <pic:cNvPicPr/>
                   </pic:nvPicPr>
                   <pic:blipFill>
-                    <a:blip r:embed="rId4"/>
+                    <a:blip r:embed="rId5"/>
                     <a:stretch>
                       <a:fillRect/>
                     </a:stretch>
@@ -276,26 +286,13 @@
           <w:b/>
           <w:bCs/>
         </w:rPr>
-        <w:t>Classe </w:t>
-      </w:r>
-      <w:proofErr w:type="spellStart"/>
-      <w:r>
-        <w:rPr>
-          <w:b/>
-          <w:bCs/>
-        </w:rPr>
-        <w:t>UserDTO</w:t>
-      </w:r>
-      <w:proofErr w:type="spellEnd"/>
-    </w:p>
-    <w:p>
-      <w:proofErr w:type="spellStart"/>
-      <w:r>
-        <w:t>UserDTO</w:t>
-      </w:r>
-      <w:proofErr w:type="spellEnd"/>
-      <w:r>
-        <w:t> è l’oggetto usato per </w:t>
+        <w:t>Classe UserDTO</w:t>
+      </w:r>
+    </w:p>
+    <w:p>
+      <w:r>
+        <w:lastRenderedPageBreak/>
+        <w:t>UserDTO è l’oggetto usato per </w:t>
       </w:r>
       <w:r>
         <w:rPr>
@@ -310,7 +307,6 @@
     </w:p>
     <w:p>
       <w:r>
-        <w:lastRenderedPageBreak/>
         <w:t>Qui manca id, perché magari non serve al client oppure non vuoi esporlo.</w:t>
       </w:r>
       <w:r>
@@ -320,6 +316,9 @@
     </w:p>
     <w:p>
       <w:r>
+        <w:rPr>
+          <w:noProof/>
+        </w:rPr>
         <w:drawing>
           <wp:inline distT="0" distB="0" distL="0" distR="0" wp14:anchorId="29F32CF8" wp14:editId="7110FFB5">
             <wp:extent cx="4578585" cy="3352972"/>
@@ -336,7 +335,7 @@
                     <pic:cNvPicPr/>
                   </pic:nvPicPr>
                   <pic:blipFill>
-                    <a:blip r:embed="rId5"/>
+                    <a:blip r:embed="rId6"/>
                     <a:stretch>
                       <a:fillRect/>
                     </a:stretch>
@@ -369,26 +368,12 @@
           <w:b/>
           <w:bCs/>
         </w:rPr>
-        <w:t>Classe </w:t>
-      </w:r>
-      <w:proofErr w:type="spellStart"/>
-      <w:r>
-        <w:rPr>
-          <w:b/>
-          <w:bCs/>
-        </w:rPr>
-        <w:t>UserMapper</w:t>
-      </w:r>
-      <w:proofErr w:type="spellEnd"/>
-    </w:p>
-    <w:p>
-      <w:proofErr w:type="spellStart"/>
-      <w:r>
-        <w:t>UserMapper</w:t>
-      </w:r>
-      <w:proofErr w:type="spellEnd"/>
-      <w:r>
-        <w:t> è la parte che fa la </w:t>
+        <w:t>Classe UserMapper</w:t>
+      </w:r>
+    </w:p>
+    <w:p>
+      <w:r>
+        <w:t>UserMapper è la parte che fa la </w:t>
       </w:r>
       <w:r>
         <w:rPr>
@@ -413,46 +398,13 @@
           <w:b/>
           <w:bCs/>
         </w:rPr>
-        <w:t>Metodo </w:t>
-      </w:r>
-      <w:proofErr w:type="spellStart"/>
-      <w:proofErr w:type="gramStart"/>
-      <w:r>
-        <w:rPr>
-          <w:b/>
-          <w:bCs/>
-        </w:rPr>
-        <w:t>toDTO</w:t>
-      </w:r>
-      <w:proofErr w:type="spellEnd"/>
-      <w:r>
-        <w:rPr>
-          <w:b/>
-          <w:bCs/>
-        </w:rPr>
-        <w:t>(</w:t>
-      </w:r>
-      <w:proofErr w:type="gramEnd"/>
-      <w:r>
-        <w:rPr>
-          <w:b/>
-          <w:bCs/>
-        </w:rPr>
-        <w:t>User user)</w:t>
+        <w:t>Metodo toDTO(User user)</w:t>
       </w:r>
       <w:r>
         <w:t xml:space="preserve"> p</w:t>
       </w:r>
       <w:r>
-        <w:t>rende un oggetto User e crea un </w:t>
-      </w:r>
-      <w:proofErr w:type="spellStart"/>
-      <w:r>
-        <w:t>UserDTO</w:t>
-      </w:r>
-      <w:proofErr w:type="spellEnd"/>
-      <w:r>
-        <w:t> con i dati</w:t>
+        <w:t>rende un oggetto User e crea un UserDTO con i dati</w:t>
       </w:r>
       <w:r>
         <w:t xml:space="preserve">. </w:t>
@@ -476,35 +428,8 @@
           <w:b/>
           <w:bCs/>
         </w:rPr>
-        <w:t>Metodo </w:t>
-      </w:r>
-      <w:proofErr w:type="spellStart"/>
-      <w:proofErr w:type="gramStart"/>
-      <w:r>
-        <w:rPr>
-          <w:b/>
-          <w:bCs/>
-        </w:rPr>
-        <w:t>toDomain</w:t>
-      </w:r>
-      <w:proofErr w:type="spellEnd"/>
-      <w:r>
-        <w:rPr>
-          <w:b/>
-          <w:bCs/>
-        </w:rPr>
-        <w:t>(</w:t>
-      </w:r>
-      <w:proofErr w:type="spellStart"/>
-      <w:proofErr w:type="gramEnd"/>
-      <w:r>
-        <w:rPr>
-          <w:b/>
-          <w:bCs/>
-        </w:rPr>
-        <w:t>UserDTO</w:t>
-      </w:r>
-      <w:proofErr w:type="spellEnd"/>
+        <w:t>Metodo toDomain(UserDTO dto)</w:t>
+      </w:r>
       <w:r>
         <w:rPr>
           <w:b/>
@@ -512,58 +437,22 @@
         </w:rPr>
         <w:t xml:space="preserve"> </w:t>
       </w:r>
-      <w:proofErr w:type="spellStart"/>
-      <w:r>
-        <w:rPr>
-          <w:b/>
-          <w:bCs/>
-        </w:rPr>
-        <w:t>dto</w:t>
-      </w:r>
-      <w:proofErr w:type="spellEnd"/>
-      <w:r>
-        <w:rPr>
-          <w:b/>
-          <w:bCs/>
-        </w:rPr>
-        <w:t>)</w:t>
-      </w:r>
-      <w:r>
-        <w:rPr>
-          <w:b/>
-          <w:bCs/>
-        </w:rPr>
-        <w:t xml:space="preserve"> </w:t>
-      </w:r>
       <w:r>
         <w:t>p</w:t>
       </w:r>
       <w:r>
-        <w:t>rende un </w:t>
-      </w:r>
-      <w:proofErr w:type="spellStart"/>
-      <w:r>
-        <w:t>UserDTO</w:t>
-      </w:r>
-      <w:proofErr w:type="spellEnd"/>
-      <w:r>
-        <w:t> e ricrea un oggetto User.</w:t>
+        <w:t>rende un UserDTO e ricrea un oggetto User.</w:t>
       </w:r>
       <w:r>
         <w:br/>
-        <w:t>L’id viene messo a </w:t>
-      </w:r>
-      <w:proofErr w:type="spellStart"/>
-      <w:r>
-        <w:t>null</w:t>
-      </w:r>
-      <w:proofErr w:type="spellEnd"/>
-      <w:r>
-        <w:t>, perché nel DTO non c’è: quindi il dominio viene ricostruito solo con i dati ricevuti.</w:t>
-      </w:r>
-    </w:p>
-    <w:p>
-      <w:r>
+        <w:t>L’id viene messo a null, perché nel DTO non c’è: quindi il dominio viene ricostruito solo con i dati ricevuti.</w:t>
+      </w:r>
+    </w:p>
+    <w:p>
+      <w:r>
+        <w:rPr>
+          <w:noProof/>
+        </w:rPr>
         <w:drawing>
           <wp:inline distT="0" distB="0" distL="0" distR="0" wp14:anchorId="72A07F68" wp14:editId="1244B4B7">
             <wp:extent cx="6026460" cy="2597283"/>
@@ -580,7 +469,7 @@
                     <pic:cNvPicPr/>
                   </pic:nvPicPr>
                   <pic:blipFill>
-                    <a:blip r:embed="rId6"/>
+                    <a:blip r:embed="rId7"/>
                     <a:stretch>
                       <a:fillRect/>
                     </a:stretch>
@@ -642,33 +531,15 @@
         <w:spacing w:after="0"/>
       </w:pPr>
       <w:r>
-        <w:t>Viene</w:t>
-      </w:r>
-      <w:r>
-        <w:t xml:space="preserve"> cre</w:t>
-      </w:r>
-      <w:r>
-        <w:t>ato</w:t>
-      </w:r>
-      <w:r>
-        <w:t xml:space="preserve"> un oggetto dominio completo e lo trasformi in DTO.</w:t>
-      </w:r>
-      <w:r>
-        <w:t xml:space="preserve"> </w:t>
-      </w:r>
-      <w:r>
-        <w:t>Poi</w:t>
-      </w:r>
-      <w:r>
-        <w:t xml:space="preserve"> vengono stampati</w:t>
-      </w:r>
-      <w:r>
-        <w:t xml:space="preserve"> i dati del DTO.</w:t>
-      </w:r>
-    </w:p>
-    <w:p>
-      <w:r>
         <w:lastRenderedPageBreak/>
+        <w:t>Viene creato un oggetto dominio completo e lo trasformi in DTO. Poi vengono stampati i dati del DTO.</w:t>
+      </w:r>
+    </w:p>
+    <w:p>
+      <w:r>
+        <w:rPr>
+          <w:noProof/>
+        </w:rPr>
         <w:drawing>
           <wp:inline distT="0" distB="0" distL="0" distR="0" wp14:anchorId="1C01C685" wp14:editId="517EDF4C">
             <wp:extent cx="6645910" cy="1209675"/>
@@ -685,7 +556,7 @@
                     <pic:cNvPicPr/>
                   </pic:nvPicPr>
                   <pic:blipFill>
-                    <a:blip r:embed="rId7"/>
+                    <a:blip r:embed="rId8"/>
                     <a:stretch>
                       <a:fillRect/>
                     </a:stretch>
@@ -708,6 +579,9 @@
     </w:p>
     <w:p>
       <w:r>
+        <w:rPr>
+          <w:noProof/>
+        </w:rPr>
         <w:drawing>
           <wp:inline distT="0" distB="0" distL="0" distR="0" wp14:anchorId="43703CBD" wp14:editId="43D70576">
             <wp:extent cx="2768742" cy="158758"/>
@@ -724,7 +598,7 @@
                     <pic:cNvPicPr/>
                   </pic:nvPicPr>
                   <pic:blipFill>
-                    <a:blip r:embed="rId8"/>
+                    <a:blip r:embed="rId9"/>
                     <a:stretch>
                       <a:fillRect/>
                     </a:stretch>
@@ -772,12 +646,25 @@
       </w:r>
     </w:p>
     <w:p>
+      <w:pPr>
+        <w:rPr>
+          <w:color w:val="EE0000"/>
+        </w:rPr>
+      </w:pPr>
+      <w:r>
+        <w:rPr>
+          <w:color w:val="EE0000"/>
+        </w:rPr>
+        <w:t>Non creo un nuovo oggetto di tipo DTO e lo passo al mapper perché il DTO deve essere creato dal mapper stesso.</w:t>
+      </w:r>
+    </w:p>
+    <w:p>
       <w:r>
         <w:drawing>
-          <wp:inline distT="0" distB="0" distL="0" distR="0" wp14:anchorId="770465B3" wp14:editId="60347CB7">
-            <wp:extent cx="6645910" cy="570865"/>
-            <wp:effectExtent l="0" t="0" r="2540" b="635"/>
-            <wp:docPr id="901790599" name="Immagine 1"/>
+          <wp:inline distT="0" distB="0" distL="0" distR="0" wp14:anchorId="56F534A1" wp14:editId="01F02B5D">
+            <wp:extent cx="6645910" cy="688340"/>
+            <wp:effectExtent l="0" t="0" r="2540" b="0"/>
+            <wp:docPr id="1471738587" name="Immagine 1"/>
             <wp:cNvGraphicFramePr>
               <a:graphicFrameLocks xmlns:a="http://schemas.openxmlformats.org/drawingml/2006/main" noChangeAspect="1"/>
             </wp:cNvGraphicFramePr>
@@ -785,7 +672,49 @@
               <a:graphicData uri="http://schemas.openxmlformats.org/drawingml/2006/picture">
                 <pic:pic xmlns:pic="http://schemas.openxmlformats.org/drawingml/2006/picture">
                   <pic:nvPicPr>
-                    <pic:cNvPr id="901790599" name=""/>
+                    <pic:cNvPr id="1471738587" name=""/>
+                    <pic:cNvPicPr/>
+                  </pic:nvPicPr>
+                  <pic:blipFill>
+                    <a:blip r:embed="rId10"/>
+                    <a:stretch>
+                      <a:fillRect/>
+                    </a:stretch>
+                  </pic:blipFill>
+                  <pic:spPr>
+                    <a:xfrm>
+                      <a:off x="0" y="0"/>
+                      <a:ext cx="6645910" cy="688340"/>
+                    </a:xfrm>
+                    <a:prstGeom prst="rect">
+                      <a:avLst/>
+                    </a:prstGeom>
+                  </pic:spPr>
+                </pic:pic>
+              </a:graphicData>
+            </a:graphic>
+          </wp:inline>
+        </w:drawing>
+      </w:r>
+    </w:p>
+    <w:p>
+      <w:r>
+        <w:rPr>
+          <w:noProof/>
+        </w:rPr>
+        <w:drawing>
+          <wp:inline distT="0" distB="0" distL="0" distR="0" wp14:anchorId="0338EAAB" wp14:editId="398F4EB4">
+            <wp:extent cx="2768742" cy="158758"/>
+            <wp:effectExtent l="0" t="0" r="0" b="0"/>
+            <wp:docPr id="1119556511" name="Immagine 1"/>
+            <wp:cNvGraphicFramePr>
+              <a:graphicFrameLocks xmlns:a="http://schemas.openxmlformats.org/drawingml/2006/main" noChangeAspect="1"/>
+            </wp:cNvGraphicFramePr>
+            <a:graphic xmlns:a="http://schemas.openxmlformats.org/drawingml/2006/main">
+              <a:graphicData uri="http://schemas.openxmlformats.org/drawingml/2006/picture">
+                <pic:pic xmlns:pic="http://schemas.openxmlformats.org/drawingml/2006/picture">
+                  <pic:nvPicPr>
+                    <pic:cNvPr id="732511407" name=""/>
                     <pic:cNvPicPr/>
                   </pic:nvPicPr>
                   <pic:blipFill>
@@ -797,7 +726,7 @@
                   <pic:spPr>
                     <a:xfrm>
                       <a:off x="0" y="0"/>
-                      <a:ext cx="6645910" cy="570865"/>
+                      <a:ext cx="2768742" cy="158758"/>
                     </a:xfrm>
                     <a:prstGeom prst="rect">
                       <a:avLst/>
@@ -812,11 +741,85 @@
     </w:p>
     <w:p>
       <w:r>
+        <w:rPr>
+          <w:b/>
+          <w:bCs/>
+        </w:rPr>
+        <w:t>Vantaggi</w:t>
+      </w:r>
+    </w:p>
+    <w:p>
+      <w:r>
+        <w:t>Riduce il traffico di rete, nasconde i dati non necessari, separa il dominio dall’interfaccia esterna e rende più semplice modificare il formato dei dati.</w:t>
+      </w:r>
+    </w:p>
+    <w:p>
+      <w:r>
+        <w:rPr>
+          <w:b/>
+          <w:bCs/>
+        </w:rPr>
+        <w:t>Limiti</w:t>
+      </w:r>
+    </w:p>
+    <w:p>
+      <w:r>
+        <w:t>Aggiunge un livello in più di codice, perché serve il mapping tra DTO e Domain Object. Se il modello è piccolo e locale, il pattern può essere superfluo.</w:t>
+      </w:r>
+    </w:p>
+    <w:p>
+      <w:r>
+        <w:rPr>
+          <w:b/>
+          <w:bCs/>
+        </w:rPr>
+        <w:t>Conclusione</w:t>
+      </w:r>
+    </w:p>
+    <w:p>
+      <w:r>
+        <w:t>Il DTO è utile quando devi scambiare dati in modo pulito, efficiente e controllato tra due parti diverse di un sistema.</w:t>
+      </w:r>
+    </w:p>
+    <w:p>
+      <w:r>
+        <w:br w:type="page"/>
+      </w:r>
+    </w:p>
+    <w:p>
+      <w:pPr>
+        <w:rPr>
+          <w:b/>
+          <w:bCs/>
+        </w:rPr>
+      </w:pPr>
+      <w:r>
+        <w:rPr>
+          <w:b/>
+          <w:bCs/>
+        </w:rPr>
+        <w:lastRenderedPageBreak/>
+        <w:t>DIAGRAMMA UML:</w:t>
+      </w:r>
+    </w:p>
+    <w:p>
+      <w:pPr>
+        <w:rPr>
+          <w:b/>
+          <w:bCs/>
+        </w:rPr>
+      </w:pPr>
+      <w:r>
+        <w:rPr>
+          <w:b/>
+          <w:bCs/>
+          <w:noProof/>
+        </w:rPr>
         <w:drawing>
-          <wp:inline distT="0" distB="0" distL="0" distR="0" wp14:anchorId="553057F3" wp14:editId="3AAAD96C">
-            <wp:extent cx="2730640" cy="139707"/>
-            <wp:effectExtent l="0" t="0" r="0" b="0"/>
-            <wp:docPr id="888499673" name="Immagine 1"/>
+          <wp:inline distT="0" distB="0" distL="0" distR="0" wp14:anchorId="4DB0CA73" wp14:editId="07254588">
+            <wp:extent cx="6409957" cy="3977648"/>
+            <wp:effectExtent l="0" t="0" r="0" b="3810"/>
+            <wp:docPr id="177389483" name="Immagine 1"/>
             <wp:cNvGraphicFramePr>
               <a:graphicFrameLocks xmlns:a="http://schemas.openxmlformats.org/drawingml/2006/main" noChangeAspect="1"/>
             </wp:cNvGraphicFramePr>
@@ -824,11 +827,17 @@
               <a:graphicData uri="http://schemas.openxmlformats.org/drawingml/2006/picture">
                 <pic:pic xmlns:pic="http://schemas.openxmlformats.org/drawingml/2006/picture">
                   <pic:nvPicPr>
-                    <pic:cNvPr id="888499673" name=""/>
+                    <pic:cNvPr id="177389483" name="Immagine 177389483"/>
                     <pic:cNvPicPr/>
                   </pic:nvPicPr>
                   <pic:blipFill>
-                    <a:blip r:embed="rId10"/>
+                    <a:blip r:embed="rId11">
+                      <a:extLst>
+                        <a:ext uri="{28A0092B-C50C-407E-A947-70E740481C1C}">
+                          <a14:useLocalDpi xmlns:a14="http://schemas.microsoft.com/office/drawing/2010/main" val="0"/>
+                        </a:ext>
+                      </a:extLst>
+                    </a:blip>
                     <a:stretch>
                       <a:fillRect/>
                     </a:stretch>
@@ -836,7 +845,7 @@
                   <pic:spPr>
                     <a:xfrm>
                       <a:off x="0" y="0"/>
-                      <a:ext cx="2730640" cy="139707"/>
+                      <a:ext cx="6409957" cy="3977648"/>
                     </a:xfrm>
                     <a:prstGeom prst="rect">
                       <a:avLst/>
@@ -851,53 +860,22 @@
     </w:p>
     <w:p>
       <w:r>
-        <w:rPr>
-          <w:b/>
-          <w:bCs/>
-        </w:rPr>
-        <w:t>Vantaggi</w:t>
-      </w:r>
-    </w:p>
-    <w:p>
-      <w:r>
-        <w:t xml:space="preserve">Riduce il traffico di rete, nasconde i dati non necessari, separa il dominio </w:t>
-      </w:r>
-      <w:r>
-        <w:t>dall’interfaccia</w:t>
-      </w:r>
-      <w:r>
-        <w:t xml:space="preserve"> esterna e rende più semplice modificare il formato dei dati.</w:t>
-      </w:r>
-    </w:p>
-    <w:p>
-      <w:r>
-        <w:rPr>
-          <w:b/>
-          <w:bCs/>
-        </w:rPr>
-        <w:t>Limiti</w:t>
-      </w:r>
-    </w:p>
-    <w:p>
-      <w:r>
-        <w:t>Aggiunge un livello in più di codice, perché serve il mapping tra DTO e Domain Object. Se il modello è piccolo e locale, il pattern può essere superfluo.</w:t>
-      </w:r>
-    </w:p>
-    <w:p>
-      <w:r>
-        <w:rPr>
-          <w:b/>
-          <w:bCs/>
-        </w:rPr>
-        <w:t>Conclusione</w:t>
-      </w:r>
-    </w:p>
-    <w:p>
-      <w:r>
-        <w:t>Il DTO è utile quando devi scambiare dati in modo pulito, efficiente e controllato tra due parti diverse di un sistema.</w:t>
-      </w:r>
-    </w:p>
-    <w:p/>
+        <w:t xml:space="preserve">Si nota come il nostro client utilizzi la classe </w:t>
+      </w:r>
+      <w:r>
+        <w:rPr>
+          <w:i/>
+          <w:iCs/>
+        </w:rPr>
+        <w:t>“UserMapper”</w:t>
+      </w:r>
+      <w:r>
+        <w:t xml:space="preserve"> per gestire il trasferimento di dati tramite oggetti, esso infatti riceve l’oggetto di tipo DTO e lo converte con la stessa, viceversa invece per la creazione.</w:t>
+      </w:r>
+      <w:r>
+        <w:t xml:space="preserve"> Il client dell’oggetto di tipo DTO non se ne fa nulla, può solo passarlo al mapper per creare il tipo di oggetto che gli serve e usare il mapper stesso per creare lui stesso un DTO da inviare.</w:t>
+      </w:r>
+    </w:p>
     <w:sectPr>
       <w:pgSz w:w="11906" w:h="16838"/>
       <w:pgMar w:top="720" w:right="720" w:bottom="720" w:left="720" w:header="708" w:footer="708" w:gutter="0"/>
@@ -906,6 +884,100 @@
     </w:sectPr>
   </w:body>
 </w:document>
+</file>
+
+<file path=word/numbering.xml><?xml version="1.0" encoding="utf-8"?>
+<w:numbering xmlns:wpc="http://schemas.microsoft.com/office/word/2010/wordprocessingCanvas" xmlns:cx="http://schemas.microsoft.com/office/drawing/2014/chartex" xmlns:cx1="http://schemas.microsoft.com/office/drawing/2015/9/8/chartex" xmlns:cx2="http://schemas.microsoft.com/office/drawing/2015/10/21/chartex" xmlns:cx3="http://schemas.microsoft.com/office/drawing/2016/5/9/chartex" xmlns:cx4="http://schemas.microsoft.com/office/drawing/2016/5/10/chartex" xmlns:cx5="http://schemas.microsoft.com/office/drawing/2016/5/11/chartex" xmlns:cx6="http://schemas.microsoft.com/office/drawing/2016/5/12/chartex" xmlns:cx7="http://schemas.microsoft.com/office/drawing/2016/5/13/chartex" xmlns:cx8="http://schemas.microsoft.com/office/drawing/2016/5/14/chartex" xmlns:mc="http://schemas.openxmlformats.org/markup-compatibility/2006" xmlns:aink="http://schemas.microsoft.com/office/drawing/2016/ink" xmlns:am3d="http://schemas.microsoft.com/office/drawing/2017/model3d" xmlns:o="urn:schemas-microsoft-com:office:office" xmlns:oel="http://schemas.microsoft.com/office/2019/extlst" xmlns:r="http://schemas.openxmlformats.org/officeDocument/2006/relationships" xmlns:m="http://schemas.openxmlformats.org/officeDocument/2006/math" xmlns:v="urn:schemas-microsoft-com:vml" xmlns:wp14="http://schemas.microsoft.com/office/word/2010/wordprocessingDrawing" xmlns:wp="http://schemas.openxmlformats.org/drawingml/2006/wordprocessingDrawing" xmlns:w10="urn:schemas-microsoft-com:office:word" xmlns:w="http://schemas.openxmlformats.org/wordprocessingml/2006/main" xmlns:w14="http://schemas.microsoft.com/office/word/2010/wordml" xmlns:w15="http://schemas.microsoft.com/office/word/2012/wordml" xmlns:w16cex="http://schemas.microsoft.com/office/word/2018/wordml/cex" xmlns:w16cid="http://schemas.microsoft.com/office/word/2016/wordml/cid" xmlns:w16="http://schemas.microsoft.com/office/word/2018/wordml" xmlns:w16du="http://schemas.microsoft.com/office/word/2023/wordml/word16du" xmlns:w16sdtdh="http://schemas.microsoft.com/office/word/2020/wordml/sdtdatahash" xmlns:w16sdtfl="http://schemas.microsoft.com/office/word/2024/wordml/sdtformatlock" xmlns:w16se="http://schemas.microsoft.com/office/word/2015/wordml/symex" xmlns:wpg="http://schemas.microsoft.com/office/word/2010/wordprocessingGroup" xmlns:wpi="http://schemas.microsoft.com/office/word/2010/wordprocessingInk" xmlns:wne="http://schemas.microsoft.com/office/word/2006/wordml" xmlns:wps="http://schemas.microsoft.com/office/word/2010/wordprocessingShape" mc:Ignorable="w14 w15 w16se w16cid w16 w16cex w16sdtdh w16sdtfl w16du wp14">
+  <w:abstractNum w:abstractNumId="0" w15:restartNumberingAfterBreak="0">
+    <w:nsid w:val="2D6F3B07"/>
+    <w:multiLevelType w:val="hybridMultilevel"/>
+    <w:tmpl w:val="81CAA106"/>
+    <w:lvl w:ilvl="0" w:tplc="04100011">
+      <w:start w:val="1"/>
+      <w:numFmt w:val="decimal"/>
+      <w:lvlText w:val="%1)"/>
+      <w:lvlJc w:val="left"/>
+      <w:pPr>
+        <w:ind w:left="720" w:hanging="360"/>
+      </w:pPr>
+    </w:lvl>
+    <w:lvl w:ilvl="1" w:tplc="04100019" w:tentative="1">
+      <w:start w:val="1"/>
+      <w:numFmt w:val="lowerLetter"/>
+      <w:lvlText w:val="%2."/>
+      <w:lvlJc w:val="left"/>
+      <w:pPr>
+        <w:ind w:left="1440" w:hanging="360"/>
+      </w:pPr>
+    </w:lvl>
+    <w:lvl w:ilvl="2" w:tplc="0410001B" w:tentative="1">
+      <w:start w:val="1"/>
+      <w:numFmt w:val="lowerRoman"/>
+      <w:lvlText w:val="%3."/>
+      <w:lvlJc w:val="right"/>
+      <w:pPr>
+        <w:ind w:left="2160" w:hanging="180"/>
+      </w:pPr>
+    </w:lvl>
+    <w:lvl w:ilvl="3" w:tplc="0410000F" w:tentative="1">
+      <w:start w:val="1"/>
+      <w:numFmt w:val="decimal"/>
+      <w:lvlText w:val="%4."/>
+      <w:lvlJc w:val="left"/>
+      <w:pPr>
+        <w:ind w:left="2880" w:hanging="360"/>
+      </w:pPr>
+    </w:lvl>
+    <w:lvl w:ilvl="4" w:tplc="04100019" w:tentative="1">
+      <w:start w:val="1"/>
+      <w:numFmt w:val="lowerLetter"/>
+      <w:lvlText w:val="%5."/>
+      <w:lvlJc w:val="left"/>
+      <w:pPr>
+        <w:ind w:left="3600" w:hanging="360"/>
+      </w:pPr>
+    </w:lvl>
+    <w:lvl w:ilvl="5" w:tplc="0410001B" w:tentative="1">
+      <w:start w:val="1"/>
+      <w:numFmt w:val="lowerRoman"/>
+      <w:lvlText w:val="%6."/>
+      <w:lvlJc w:val="right"/>
+      <w:pPr>
+        <w:ind w:left="4320" w:hanging="180"/>
+      </w:pPr>
+    </w:lvl>
+    <w:lvl w:ilvl="6" w:tplc="0410000F" w:tentative="1">
+      <w:start w:val="1"/>
+      <w:numFmt w:val="decimal"/>
+      <w:lvlText w:val="%7."/>
+      <w:lvlJc w:val="left"/>
+      <w:pPr>
+        <w:ind w:left="5040" w:hanging="360"/>
+      </w:pPr>
+    </w:lvl>
+    <w:lvl w:ilvl="7" w:tplc="04100019" w:tentative="1">
+      <w:start w:val="1"/>
+      <w:numFmt w:val="lowerLetter"/>
+      <w:lvlText w:val="%8."/>
+      <w:lvlJc w:val="left"/>
+      <w:pPr>
+        <w:ind w:left="5760" w:hanging="360"/>
+      </w:pPr>
+    </w:lvl>
+    <w:lvl w:ilvl="8" w:tplc="0410001B" w:tentative="1">
+      <w:start w:val="1"/>
+      <w:numFmt w:val="lowerRoman"/>
+      <w:lvlText w:val="%9."/>
+      <w:lvlJc w:val="right"/>
+      <w:pPr>
+        <w:ind w:left="6480" w:hanging="180"/>
+      </w:pPr>
+    </w:lvl>
+  </w:abstractNum>
+  <w:num w:numId="1" w16cid:durableId="600187570">
+    <w:abstractNumId w:val="0"/>
+  </w:num>
+</w:numbering>
 </file>
 
 <file path=word/styles.xml><?xml version="1.0" encoding="utf-8"?>
@@ -1510,6 +1582,7 @@
   <w:style w:type="character" w:default="1" w:styleId="Carpredefinitoparagrafo">
     <w:name w:val="Default Paragraph Font"/>
     <w:uiPriority w:val="1"/>
+    <w:semiHidden/>
     <w:unhideWhenUsed/>
   </w:style>
   <w:style w:type="table" w:default="1" w:styleId="Tabellanormale">

</xml_diff>